<commit_message>
docs: restyle dynamic views (dark palette) and add English docx
Replace the navy-blue theme with a dark/black-and-white palette across
all 4 documents (tables, headings, cover page), matching the reference
UML use-case style (system boundary box, actor figure, dark grid
background). Use cases now render as custom SVG diagrams instead of
plain Mermaid flowcharts.

Add an English .docx for each of the 4 documents (use cases, sequence,
activity, state), built from translated content with the same dark
styling and English-labeled diagrams. Markdown sources stay
Spanish-only per request; only the Word exports are bilingual.

Co-Authored-By: Claude Sonnet 5 <noreply@anthropic.com>
</commit_message>
<xml_diff>
--- a/02-documentacion-analisis-software/01-Casos-de-Uso.docx
+++ b/02-documentacion-analisis-software/01-Casos-de-Uso.docx
@@ -2,94 +2,134 @@
 <file path=word/document.xml><?xml version="1.0" encoding="utf-8"?>
 <w:document xmlns:wpc="http://schemas.microsoft.com/office/word/2010/wordprocessingCanvas" xmlns:mc="http://schemas.openxmlformats.org/markup-compatibility/2006" xmlns:o="urn:schemas-microsoft-com:office:office" xmlns:r="http://schemas.openxmlformats.org/officeDocument/2006/relationships" xmlns:m="http://schemas.openxmlformats.org/officeDocument/2006/math" xmlns:v="urn:schemas-microsoft-com:vml" xmlns:wp14="http://schemas.microsoft.com/office/word/2010/wordprocessingDrawing" xmlns:wp="http://schemas.openxmlformats.org/drawingml/2006/wordprocessingDrawing" xmlns:w10="urn:schemas-microsoft-com:office:word" xmlns:w="http://schemas.openxmlformats.org/wordprocessingml/2006/main" xmlns:w14="http://schemas.microsoft.com/office/word/2010/wordml" xmlns:w15="http://schemas.microsoft.com/office/word/2012/wordml" xmlns:wpg="http://schemas.microsoft.com/office/word/2010/wordprocessingGroup" xmlns:wpi="http://schemas.microsoft.com/office/word/2010/wordprocessingInk" xmlns:wne="http://schemas.microsoft.com/office/word/2006/wordml" xmlns:wps="http://schemas.microsoft.com/office/word/2010/wordprocessingShape" xmlns:cx="http://schemas.microsoft.com/office/drawing/2014/chartex" xmlns:cx1="http://schemas.microsoft.com/office/drawing/2015/9/8/chartex" xmlns:cx2="http://schemas.microsoft.com/office/drawing/2015/10/21/chartex" xmlns:cx3="http://schemas.microsoft.com/office/drawing/2016/5/9/chartex" xmlns:cx4="http://schemas.microsoft.com/office/drawing/2016/5/10/chartex" xmlns:cx5="http://schemas.microsoft.com/office/drawing/2016/5/11/chartex" xmlns:cx6="http://schemas.microsoft.com/office/drawing/2016/5/12/chartex" xmlns:cx7="http://schemas.microsoft.com/office/drawing/2016/5/13/chartex" xmlns:cx8="http://schemas.microsoft.com/office/drawing/2016/5/14/chartex" xmlns:aink="http://schemas.microsoft.com/office/drawing/2016/ink" xmlns:am3d="http://schemas.microsoft.com/office/drawing/2017/model3d" xmlns:w16cex="http://schemas.microsoft.com/office/word/2018/wordml/cex" xmlns:w16cid="http://schemas.microsoft.com/office/word/2016/wordml/cid" xmlns:w16="http://schemas.microsoft.com/office/word/2018/wordml" xmlns:w16sdtdh="http://schemas.microsoft.com/office/word/2020/wordml/sdtdatahash" xmlns:w16se="http://schemas.microsoft.com/office/word/2015/wordml/symex" mc:Ignorable="w14 w15 wp14">
   <w:body>
-    <w:p>
-      <w:pPr>
-        <w:spacing w:after="200" w:before="600"/>
-        <w:jc w:val="center"/>
-      </w:pPr>
-      <w:r>
-        <w:rPr>
-          <w:rFonts w:ascii="Calibri" w:cs="Calibri" w:eastAsia="Calibri" w:hAnsi="Calibri"/>
-          <w:b/>
-          <w:bCs/>
-          <w:sz w:val="40"/>
-          <w:szCs w:val="40"/>
-        </w:rPr>
-        <w:t xml:space="preserve">DOCUMENTACIÓN DE ANÁLISIS DEL SOFTWARE — CASOS DE USO</w:t>
-      </w:r>
-    </w:p>
-    <w:p>
-      <w:pPr>
-        <w:spacing w:after="400" w:before="100"/>
-        <w:jc w:val="center"/>
-      </w:pPr>
-      <w:r>
-        <w:rPr>
-          <w:rFonts w:ascii="Calibri" w:cs="Calibri" w:eastAsia="Calibri" w:hAnsi="Calibri"/>
-          <w:b/>
-          <w:bCs/>
-          <w:sz w:val="30"/>
-          <w:szCs w:val="30"/>
-        </w:rPr>
-        <w:t xml:space="preserve">PROYECTO: RENTAMOVIL — PLATAFORMA PARA EMPRESA DE ALQUILER DE VEHÍCULOS</w:t>
-      </w:r>
-    </w:p>
-    <w:p>
-      <w:pPr>
-        <w:spacing w:after="160" w:line="276"/>
-        <w:jc w:val="center"/>
-      </w:pPr>
-      <w:r>
-        <w:rPr>
-          <w:rFonts w:ascii="Calibri" w:cs="Calibri" w:eastAsia="Calibri" w:hAnsi="Calibri"/>
-          <w:b/>
-          <w:bCs/>
-          <w:sz w:val="21"/>
-          <w:szCs w:val="21"/>
-        </w:rPr>
-        <w:t xml:space="preserve">INTEGRANTES:</w:t>
-      </w:r>
-      <w:r>
-        <w:rPr>
-          <w:rFonts w:ascii="Calibri" w:cs="Calibri" w:eastAsia="Calibri" w:hAnsi="Calibri"/>
-          <w:sz w:val="21"/>
-          <w:szCs w:val="21"/>
-        </w:rPr>
-        <w:t xml:space="preserve"> Thiago Fabian Rojas Guevara — David Santiago Erez Rodríguez — Nicole Dayana Ramírez Vargas</w:t>
-      </w:r>
-    </w:p>
-    <w:p>
-      <w:pPr>
-        <w:spacing w:after="160" w:line="276"/>
-        <w:jc w:val="center"/>
-      </w:pPr>
-      <w:r>
-        <w:rPr>
-          <w:rFonts w:ascii="Calibri" w:cs="Calibri" w:eastAsia="Calibri" w:hAnsi="Calibri"/>
-          <w:b/>
-          <w:bCs/>
-          <w:sz w:val="21"/>
-          <w:szCs w:val="21"/>
-        </w:rPr>
-        <w:t xml:space="preserve">SERVICIO NACIONAL DE APRENDIZAJE — SENA — ANÁLISIS Y DESARROLLO DE SOFTWARE 3145556</w:t>
-      </w:r>
-    </w:p>
-    <w:p>
-      <w:pPr>
-        <w:spacing w:after="160" w:line="276"/>
-        <w:jc w:val="center"/>
-      </w:pPr>
-      <w:r>
-        <w:rPr>
-          <w:rFonts w:ascii="Calibri" w:cs="Calibri" w:eastAsia="Calibri" w:hAnsi="Calibri"/>
-          <w:b/>
-          <w:bCs/>
-          <w:sz w:val="21"/>
-          <w:szCs w:val="21"/>
-        </w:rPr>
-        <w:t xml:space="preserve">2026</w:t>
-      </w:r>
-    </w:p>
+    <w:tbl>
+      <w:tblPr>
+        <w:tblW w:type="dxa" w:w="9026"/>
+        <w:tblBorders>
+          <w:top w:val="none" w:color="FFFFFF" w:sz="0"/>
+          <w:left w:val="none" w:color="FFFFFF" w:sz="0"/>
+          <w:bottom w:val="none" w:color="FFFFFF" w:sz="0"/>
+          <w:right w:val="none" w:color="FFFFFF" w:sz="0"/>
+          <w:insideH w:val="none" w:color="FFFFFF" w:sz="0"/>
+          <w:insideV w:val="none" w:color="FFFFFF" w:sz="0"/>
+        </w:tblBorders>
+      </w:tblPr>
+      <w:tblGrid>
+        <w:gridCol w:w="9026"/>
+      </w:tblGrid>
+      <w:tr>
+        <w:trPr>
+          <w:trHeight w:val="13600" w:hRule="exact"/>
+        </w:trPr>
+        <w:tc>
+          <w:tcPr>
+            <w:tcW w:type="dxa" w:w="9026"/>
+            <w:shd w:fill="0B0B0B" w:val="clear"/>
+            <w:tcMar>
+              <w:top w:type="dxa" w:w="200"/>
+              <w:left w:type="dxa" w:w="400"/>
+              <w:bottom w:type="dxa" w:w="200"/>
+              <w:right w:type="dxa" w:w="400"/>
+            </w:tcMar>
+            <w:vAlign w:val="center"/>
+          </w:tcPr>
+          <w:p>
+            <w:pPr>
+              <w:spacing w:after="200" w:before="200"/>
+              <w:jc w:val="center"/>
+            </w:pPr>
+            <w:r>
+              <w:rPr>
+                <w:rFonts w:ascii="Calibri" w:cs="Calibri" w:eastAsia="Calibri" w:hAnsi="Calibri"/>
+                <w:b/>
+                <w:bCs/>
+                <w:color w:val="FFFFFF"/>
+                <w:sz w:val="40"/>
+                <w:szCs w:val="40"/>
+              </w:rPr>
+              <w:t xml:space="preserve">DOCUMENTACIÓN DE ANÁLISIS DEL SOFTWARE — CASOS DE USO</w:t>
+            </w:r>
+          </w:p>
+          <w:p>
+            <w:pPr>
+              <w:spacing w:after="300" w:before="100"/>
+              <w:jc w:val="center"/>
+            </w:pPr>
+            <w:r>
+              <w:rPr>
+                <w:rFonts w:ascii="Calibri" w:cs="Calibri" w:eastAsia="Calibri" w:hAnsi="Calibri"/>
+                <w:b/>
+                <w:bCs/>
+                <w:color w:val="FFFFFF"/>
+                <w:sz w:val="30"/>
+                <w:szCs w:val="30"/>
+              </w:rPr>
+              <w:t xml:space="preserve">PROYECTO: RENTAMOVIL — PLATAFORMA PARA EMPRESA DE ALQUILER DE VEHÍCULOS</w:t>
+            </w:r>
+          </w:p>
+          <w:p>
+            <w:pPr>
+              <w:spacing w:after="160" w:line="276"/>
+              <w:jc w:val="center"/>
+            </w:pPr>
+            <w:r>
+              <w:rPr>
+                <w:rFonts w:ascii="Calibri" w:cs="Calibri" w:eastAsia="Calibri" w:hAnsi="Calibri"/>
+                <w:b/>
+                <w:bCs/>
+                <w:color w:val="FFFFFF"/>
+                <w:sz w:val="21"/>
+                <w:szCs w:val="21"/>
+              </w:rPr>
+              <w:t xml:space="preserve">INTEGRANTES:</w:t>
+            </w:r>
+            <w:r>
+              <w:rPr>
+                <w:rFonts w:ascii="Calibri" w:cs="Calibri" w:eastAsia="Calibri" w:hAnsi="Calibri"/>
+                <w:color w:val="FFFFFF"/>
+                <w:sz w:val="21"/>
+                <w:szCs w:val="21"/>
+              </w:rPr>
+              <w:t xml:space="preserve"> Thiago Fabian Rojas Guevara — David Santiago Erez Rodríguez — Nicole Dayana Ramírez Vargas</w:t>
+            </w:r>
+          </w:p>
+          <w:p>
+            <w:pPr>
+              <w:spacing w:after="160" w:line="276"/>
+              <w:jc w:val="center"/>
+            </w:pPr>
+            <w:r>
+              <w:rPr>
+                <w:rFonts w:ascii="Calibri" w:cs="Calibri" w:eastAsia="Calibri" w:hAnsi="Calibri"/>
+                <w:b/>
+                <w:bCs/>
+                <w:color w:val="FFFFFF"/>
+                <w:sz w:val="21"/>
+                <w:szCs w:val="21"/>
+              </w:rPr>
+              <w:t xml:space="preserve">SERVICIO NACIONAL DE APRENDIZAJE — SENA — ANÁLISIS Y DESARROLLO DE SOFTWARE 3145556</w:t>
+            </w:r>
+          </w:p>
+          <w:p>
+            <w:pPr>
+              <w:spacing w:after="160" w:line="276"/>
+              <w:jc w:val="center"/>
+            </w:pPr>
+            <w:r>
+              <w:rPr>
+                <w:rFonts w:ascii="Calibri" w:cs="Calibri" w:eastAsia="Calibri" w:hAnsi="Calibri"/>
+                <w:b/>
+                <w:bCs/>
+                <w:color w:val="FFFFFF"/>
+                <w:sz w:val="21"/>
+                <w:szCs w:val="21"/>
+              </w:rPr>
+              <w:t xml:space="preserve">2026</w:t>
+            </w:r>
+          </w:p>
+        </w:tc>
+      </w:tr>
+    </w:tbl>
     <w:p>
       <w:r>
         <w:br w:type="page"/>
@@ -170,7 +210,7 @@
         <w:tc>
           <w:tcPr>
             <w:tcW w:type="dxa" w:w="4513"/>
-            <w:shd w:fill="1F3864" w:val="clear"/>
+            <w:shd w:fill="141414" w:val="clear"/>
             <w:tcMar>
               <w:top w:type="dxa" w:w="60"/>
               <w:left w:type="dxa" w:w="100"/>
@@ -195,7 +235,7 @@
         <w:tc>
           <w:tcPr>
             <w:tcW w:type="dxa" w:w="4513"/>
-            <w:shd w:fill="1F3864" w:val="clear"/>
+            <w:shd w:fill="141414" w:val="clear"/>
             <w:tcMar>
               <w:top w:type="dxa" w:w="60"/>
               <w:left w:type="dxa" w:w="100"/>
@@ -546,7 +586,7 @@
         <w:tc>
           <w:tcPr>
             <w:tcW w:type="dxa" w:w="3008"/>
-            <w:shd w:fill="1F3864" w:val="clear"/>
+            <w:shd w:fill="141414" w:val="clear"/>
             <w:tcMar>
               <w:top w:type="dxa" w:w="60"/>
               <w:left w:type="dxa" w:w="100"/>
@@ -571,7 +611,7 @@
         <w:tc>
           <w:tcPr>
             <w:tcW w:type="dxa" w:w="3008"/>
-            <w:shd w:fill="1F3864" w:val="clear"/>
+            <w:shd w:fill="141414" w:val="clear"/>
             <w:tcMar>
               <w:top w:type="dxa" w:w="60"/>
               <w:left w:type="dxa" w:w="100"/>
@@ -596,7 +636,7 @@
         <w:tc>
           <w:tcPr>
             <w:tcW w:type="dxa" w:w="3010"/>
-            <w:shd w:fill="1F3864" w:val="clear"/>
+            <w:shd w:fill="141414" w:val="clear"/>
             <w:tcMar>
               <w:top w:type="dxa" w:w="60"/>
               <w:left w:type="dxa" w:w="100"/>
@@ -2022,7 +2062,7 @@
       <w:r>
         <w:drawing>
           <wp:inline distT="0" distB="0" distL="0" distR="0">
-            <wp:extent cx="5667375" cy="1933575"/>
+            <wp:extent cx="5667375" cy="3190875"/>
             <wp:effectExtent t="0" r="0" b="0" l="0"/>
             <wp:docPr id="1" name="" descr="" title=""/>
             <wp:cNvGraphicFramePr>
@@ -2047,7 +2087,7 @@
                   <pic:spPr bwMode="auto">
                     <a:xfrm>
                       <a:off x="0" y="0"/>
-                      <a:ext cx="5667375" cy="1933575"/>
+                      <a:ext cx="5667375" cy="3190875"/>
                     </a:xfrm>
                     <a:prstGeom prst="rect">
                       <a:avLst/>
@@ -2083,7 +2123,7 @@
         <w:tc>
           <w:tcPr>
             <w:tcW w:type="dxa" w:w="2300"/>
-            <w:shd w:fill="1F3864" w:val="clear"/>
+            <w:shd w:fill="141414" w:val="clear"/>
             <w:tcMar>
               <w:top w:type="dxa" w:w="60"/>
               <w:left w:type="dxa" w:w="100"/>
@@ -2108,7 +2148,7 @@
         <w:tc>
           <w:tcPr>
             <w:tcW w:type="dxa" w:w="6726"/>
-            <w:shd w:fill="1F3864" w:val="clear"/>
+            <w:shd w:fill="141414" w:val="clear"/>
             <w:tcMar>
               <w:top w:type="dxa" w:w="60"/>
               <w:left w:type="dxa" w:w="100"/>
@@ -2382,7 +2422,7 @@
       <w:r>
         <w:drawing>
           <wp:inline distT="0" distB="0" distL="0" distR="0">
-            <wp:extent cx="5667375" cy="1400175"/>
+            <wp:extent cx="5667375" cy="3190875"/>
             <wp:effectExtent t="0" r="0" b="0" l="0"/>
             <wp:docPr id="2" name="" descr="" title=""/>
             <wp:cNvGraphicFramePr>
@@ -2407,7 +2447,7 @@
                   <pic:spPr bwMode="auto">
                     <a:xfrm>
                       <a:off x="0" y="0"/>
-                      <a:ext cx="5667375" cy="1400175"/>
+                      <a:ext cx="5667375" cy="3190875"/>
                     </a:xfrm>
                     <a:prstGeom prst="rect">
                       <a:avLst/>
@@ -2443,7 +2483,7 @@
         <w:tc>
           <w:tcPr>
             <w:tcW w:type="dxa" w:w="2300"/>
-            <w:shd w:fill="1F3864" w:val="clear"/>
+            <w:shd w:fill="141414" w:val="clear"/>
             <w:tcMar>
               <w:top w:type="dxa" w:w="60"/>
               <w:left w:type="dxa" w:w="100"/>
@@ -2468,7 +2508,7 @@
         <w:tc>
           <w:tcPr>
             <w:tcW w:type="dxa" w:w="6726"/>
-            <w:shd w:fill="1F3864" w:val="clear"/>
+            <w:shd w:fill="141414" w:val="clear"/>
             <w:tcMar>
               <w:top w:type="dxa" w:w="60"/>
               <w:left w:type="dxa" w:w="100"/>
@@ -2734,7 +2774,7 @@
       <w:r>
         <w:drawing>
           <wp:inline distT="0" distB="0" distL="0" distR="0">
-            <wp:extent cx="5667375" cy="1400175"/>
+            <wp:extent cx="5667375" cy="3190875"/>
             <wp:effectExtent t="0" r="0" b="0" l="0"/>
             <wp:docPr id="3" name="" descr="" title=""/>
             <wp:cNvGraphicFramePr>
@@ -2759,7 +2799,7 @@
                   <pic:spPr bwMode="auto">
                     <a:xfrm>
                       <a:off x="0" y="0"/>
-                      <a:ext cx="5667375" cy="1400175"/>
+                      <a:ext cx="5667375" cy="3190875"/>
                     </a:xfrm>
                     <a:prstGeom prst="rect">
                       <a:avLst/>
@@ -2795,7 +2835,7 @@
         <w:tc>
           <w:tcPr>
             <w:tcW w:type="dxa" w:w="2300"/>
-            <w:shd w:fill="1F3864" w:val="clear"/>
+            <w:shd w:fill="141414" w:val="clear"/>
             <w:tcMar>
               <w:top w:type="dxa" w:w="60"/>
               <w:left w:type="dxa" w:w="100"/>
@@ -2820,7 +2860,7 @@
         <w:tc>
           <w:tcPr>
             <w:tcW w:type="dxa" w:w="6726"/>
-            <w:shd w:fill="1F3864" w:val="clear"/>
+            <w:shd w:fill="141414" w:val="clear"/>
             <w:tcMar>
               <w:top w:type="dxa" w:w="60"/>
               <w:left w:type="dxa" w:w="100"/>
@@ -3086,7 +3126,7 @@
       <w:r>
         <w:drawing>
           <wp:inline distT="0" distB="0" distL="0" distR="0">
-            <wp:extent cx="5667375" cy="1685925"/>
+            <wp:extent cx="5667375" cy="3190875"/>
             <wp:effectExtent t="0" r="0" b="0" l="0"/>
             <wp:docPr id="4" name="" descr="" title=""/>
             <wp:cNvGraphicFramePr>
@@ -3111,7 +3151,7 @@
                   <pic:spPr bwMode="auto">
                     <a:xfrm>
                       <a:off x="0" y="0"/>
-                      <a:ext cx="5667375" cy="1685925"/>
+                      <a:ext cx="5667375" cy="3190875"/>
                     </a:xfrm>
                     <a:prstGeom prst="rect">
                       <a:avLst/>
@@ -3147,7 +3187,7 @@
         <w:tc>
           <w:tcPr>
             <w:tcW w:type="dxa" w:w="2300"/>
-            <w:shd w:fill="1F3864" w:val="clear"/>
+            <w:shd w:fill="141414" w:val="clear"/>
             <w:tcMar>
               <w:top w:type="dxa" w:w="60"/>
               <w:left w:type="dxa" w:w="100"/>
@@ -3172,7 +3212,7 @@
         <w:tc>
           <w:tcPr>
             <w:tcW w:type="dxa" w:w="6726"/>
-            <w:shd w:fill="1F3864" w:val="clear"/>
+            <w:shd w:fill="141414" w:val="clear"/>
             <w:tcMar>
               <w:top w:type="dxa" w:w="60"/>
               <w:left w:type="dxa" w:w="100"/>
@@ -3429,7 +3469,7 @@
       <w:r>
         <w:drawing>
           <wp:inline distT="0" distB="0" distL="0" distR="0">
-            <wp:extent cx="5667375" cy="1685925"/>
+            <wp:extent cx="5667375" cy="3190875"/>
             <wp:effectExtent t="0" r="0" b="0" l="0"/>
             <wp:docPr id="5" name="" descr="" title=""/>
             <wp:cNvGraphicFramePr>
@@ -3454,7 +3494,7 @@
                   <pic:spPr bwMode="auto">
                     <a:xfrm>
                       <a:off x="0" y="0"/>
-                      <a:ext cx="5667375" cy="1685925"/>
+                      <a:ext cx="5667375" cy="3190875"/>
                     </a:xfrm>
                     <a:prstGeom prst="rect">
                       <a:avLst/>
@@ -3490,7 +3530,7 @@
         <w:tc>
           <w:tcPr>
             <w:tcW w:type="dxa" w:w="2300"/>
-            <w:shd w:fill="1F3864" w:val="clear"/>
+            <w:shd w:fill="141414" w:val="clear"/>
             <w:tcMar>
               <w:top w:type="dxa" w:w="60"/>
               <w:left w:type="dxa" w:w="100"/>
@@ -3515,7 +3555,7 @@
         <w:tc>
           <w:tcPr>
             <w:tcW w:type="dxa" w:w="6726"/>
-            <w:shd w:fill="1F3864" w:val="clear"/>
+            <w:shd w:fill="141414" w:val="clear"/>
             <w:tcMar>
               <w:top w:type="dxa" w:w="60"/>
               <w:left w:type="dxa" w:w="100"/>
@@ -3772,7 +3812,7 @@
       <w:r>
         <w:drawing>
           <wp:inline distT="0" distB="0" distL="0" distR="0">
-            <wp:extent cx="5667375" cy="1685925"/>
+            <wp:extent cx="5667375" cy="3190875"/>
             <wp:effectExtent t="0" r="0" b="0" l="0"/>
             <wp:docPr id="6" name="" descr="" title=""/>
             <wp:cNvGraphicFramePr>
@@ -3797,7 +3837,7 @@
                   <pic:spPr bwMode="auto">
                     <a:xfrm>
                       <a:off x="0" y="0"/>
-                      <a:ext cx="5667375" cy="1685925"/>
+                      <a:ext cx="5667375" cy="3190875"/>
                     </a:xfrm>
                     <a:prstGeom prst="rect">
                       <a:avLst/>
@@ -3833,7 +3873,7 @@
         <w:tc>
           <w:tcPr>
             <w:tcW w:type="dxa" w:w="2300"/>
-            <w:shd w:fill="1F3864" w:val="clear"/>
+            <w:shd w:fill="141414" w:val="clear"/>
             <w:tcMar>
               <w:top w:type="dxa" w:w="60"/>
               <w:left w:type="dxa" w:w="100"/>
@@ -3858,7 +3898,7 @@
         <w:tc>
           <w:tcPr>
             <w:tcW w:type="dxa" w:w="6726"/>
-            <w:shd w:fill="1F3864" w:val="clear"/>
+            <w:shd w:fill="141414" w:val="clear"/>
             <w:tcMar>
               <w:top w:type="dxa" w:w="60"/>
               <w:left w:type="dxa" w:w="100"/>
@@ -4133,7 +4173,7 @@
       <w:r>
         <w:drawing>
           <wp:inline distT="0" distB="0" distL="0" distR="0">
-            <wp:extent cx="5667375" cy="1685925"/>
+            <wp:extent cx="5667375" cy="3190875"/>
             <wp:effectExtent t="0" r="0" b="0" l="0"/>
             <wp:docPr id="7" name="" descr="" title=""/>
             <wp:cNvGraphicFramePr>
@@ -4158,7 +4198,7 @@
                   <pic:spPr bwMode="auto">
                     <a:xfrm>
                       <a:off x="0" y="0"/>
-                      <a:ext cx="5667375" cy="1685925"/>
+                      <a:ext cx="5667375" cy="3190875"/>
                     </a:xfrm>
                     <a:prstGeom prst="rect">
                       <a:avLst/>
@@ -4194,7 +4234,7 @@
         <w:tc>
           <w:tcPr>
             <w:tcW w:type="dxa" w:w="2300"/>
-            <w:shd w:fill="1F3864" w:val="clear"/>
+            <w:shd w:fill="141414" w:val="clear"/>
             <w:tcMar>
               <w:top w:type="dxa" w:w="60"/>
               <w:left w:type="dxa" w:w="100"/>
@@ -4219,7 +4259,7 @@
         <w:tc>
           <w:tcPr>
             <w:tcW w:type="dxa" w:w="6726"/>
-            <w:shd w:fill="1F3864" w:val="clear"/>
+            <w:shd w:fill="141414" w:val="clear"/>
             <w:tcMar>
               <w:top w:type="dxa" w:w="60"/>
               <w:left w:type="dxa" w:w="100"/>
@@ -4476,7 +4516,7 @@
       <w:r>
         <w:drawing>
           <wp:inline distT="0" distB="0" distL="0" distR="0">
-            <wp:extent cx="5667375" cy="1685925"/>
+            <wp:extent cx="5667375" cy="3190875"/>
             <wp:effectExtent t="0" r="0" b="0" l="0"/>
             <wp:docPr id="8" name="" descr="" title=""/>
             <wp:cNvGraphicFramePr>
@@ -4501,7 +4541,7 @@
                   <pic:spPr bwMode="auto">
                     <a:xfrm>
                       <a:off x="0" y="0"/>
-                      <a:ext cx="5667375" cy="1685925"/>
+                      <a:ext cx="5667375" cy="3190875"/>
                     </a:xfrm>
                     <a:prstGeom prst="rect">
                       <a:avLst/>
@@ -4537,7 +4577,7 @@
         <w:tc>
           <w:tcPr>
             <w:tcW w:type="dxa" w:w="2300"/>
-            <w:shd w:fill="1F3864" w:val="clear"/>
+            <w:shd w:fill="141414" w:val="clear"/>
             <w:tcMar>
               <w:top w:type="dxa" w:w="60"/>
               <w:left w:type="dxa" w:w="100"/>
@@ -4562,7 +4602,7 @@
         <w:tc>
           <w:tcPr>
             <w:tcW w:type="dxa" w:w="6726"/>
-            <w:shd w:fill="1F3864" w:val="clear"/>
+            <w:shd w:fill="141414" w:val="clear"/>
             <w:tcMar>
               <w:top w:type="dxa" w:w="60"/>
               <w:left w:type="dxa" w:w="100"/>
@@ -4837,7 +4877,7 @@
       <w:r>
         <w:drawing>
           <wp:inline distT="0" distB="0" distL="0" distR="0">
-            <wp:extent cx="5667375" cy="1685925"/>
+            <wp:extent cx="5667375" cy="3190875"/>
             <wp:effectExtent t="0" r="0" b="0" l="0"/>
             <wp:docPr id="9" name="" descr="" title=""/>
             <wp:cNvGraphicFramePr>
@@ -4862,7 +4902,7 @@
                   <pic:spPr bwMode="auto">
                     <a:xfrm>
                       <a:off x="0" y="0"/>
-                      <a:ext cx="5667375" cy="1685925"/>
+                      <a:ext cx="5667375" cy="3190875"/>
                     </a:xfrm>
                     <a:prstGeom prst="rect">
                       <a:avLst/>
@@ -4898,7 +4938,7 @@
         <w:tc>
           <w:tcPr>
             <w:tcW w:type="dxa" w:w="2300"/>
-            <w:shd w:fill="1F3864" w:val="clear"/>
+            <w:shd w:fill="141414" w:val="clear"/>
             <w:tcMar>
               <w:top w:type="dxa" w:w="60"/>
               <w:left w:type="dxa" w:w="100"/>
@@ -4923,7 +4963,7 @@
         <w:tc>
           <w:tcPr>
             <w:tcW w:type="dxa" w:w="6726"/>
-            <w:shd w:fill="1F3864" w:val="clear"/>
+            <w:shd w:fill="141414" w:val="clear"/>
             <w:tcMar>
               <w:top w:type="dxa" w:w="60"/>
               <w:left w:type="dxa" w:w="100"/>
@@ -5224,7 +5264,7 @@
       <w:r>
         <w:drawing>
           <wp:inline distT="0" distB="0" distL="0" distR="0">
-            <wp:extent cx="5667375" cy="1685925"/>
+            <wp:extent cx="5667375" cy="3190875"/>
             <wp:effectExtent t="0" r="0" b="0" l="0"/>
             <wp:docPr id="10" name="" descr="" title=""/>
             <wp:cNvGraphicFramePr>
@@ -5249,7 +5289,7 @@
                   <pic:spPr bwMode="auto">
                     <a:xfrm>
                       <a:off x="0" y="0"/>
-                      <a:ext cx="5667375" cy="1685925"/>
+                      <a:ext cx="5667375" cy="3190875"/>
                     </a:xfrm>
                     <a:prstGeom prst="rect">
                       <a:avLst/>
@@ -5285,7 +5325,7 @@
         <w:tc>
           <w:tcPr>
             <w:tcW w:type="dxa" w:w="2300"/>
-            <w:shd w:fill="1F3864" w:val="clear"/>
+            <w:shd w:fill="141414" w:val="clear"/>
             <w:tcMar>
               <w:top w:type="dxa" w:w="60"/>
               <w:left w:type="dxa" w:w="100"/>
@@ -5310,7 +5350,7 @@
         <w:tc>
           <w:tcPr>
             <w:tcW w:type="dxa" w:w="6726"/>
-            <w:shd w:fill="1F3864" w:val="clear"/>
+            <w:shd w:fill="141414" w:val="clear"/>
             <w:tcMar>
               <w:top w:type="dxa" w:w="60"/>
               <w:left w:type="dxa" w:w="100"/>
@@ -5567,7 +5607,7 @@
       <w:r>
         <w:drawing>
           <wp:inline distT="0" distB="0" distL="0" distR="0">
-            <wp:extent cx="5667375" cy="1685925"/>
+            <wp:extent cx="5667375" cy="3190875"/>
             <wp:effectExtent t="0" r="0" b="0" l="0"/>
             <wp:docPr id="11" name="" descr="" title=""/>
             <wp:cNvGraphicFramePr>
@@ -5592,7 +5632,7 @@
                   <pic:spPr bwMode="auto">
                     <a:xfrm>
                       <a:off x="0" y="0"/>
-                      <a:ext cx="5667375" cy="1685925"/>
+                      <a:ext cx="5667375" cy="3190875"/>
                     </a:xfrm>
                     <a:prstGeom prst="rect">
                       <a:avLst/>
@@ -5628,7 +5668,7 @@
         <w:tc>
           <w:tcPr>
             <w:tcW w:type="dxa" w:w="2300"/>
-            <w:shd w:fill="1F3864" w:val="clear"/>
+            <w:shd w:fill="141414" w:val="clear"/>
             <w:tcMar>
               <w:top w:type="dxa" w:w="60"/>
               <w:left w:type="dxa" w:w="100"/>
@@ -5653,7 +5693,7 @@
         <w:tc>
           <w:tcPr>
             <w:tcW w:type="dxa" w:w="6726"/>
-            <w:shd w:fill="1F3864" w:val="clear"/>
+            <w:shd w:fill="141414" w:val="clear"/>
             <w:tcMar>
               <w:top w:type="dxa" w:w="60"/>
               <w:left w:type="dxa" w:w="100"/>
@@ -5910,7 +5950,7 @@
       <w:r>
         <w:drawing>
           <wp:inline distT="0" distB="0" distL="0" distR="0">
-            <wp:extent cx="5667375" cy="1685925"/>
+            <wp:extent cx="5667375" cy="3190875"/>
             <wp:effectExtent t="0" r="0" b="0" l="0"/>
             <wp:docPr id="12" name="" descr="" title=""/>
             <wp:cNvGraphicFramePr>
@@ -5935,7 +5975,7 @@
                   <pic:spPr bwMode="auto">
                     <a:xfrm>
                       <a:off x="0" y="0"/>
-                      <a:ext cx="5667375" cy="1685925"/>
+                      <a:ext cx="5667375" cy="3190875"/>
                     </a:xfrm>
                     <a:prstGeom prst="rect">
                       <a:avLst/>
@@ -5971,7 +6011,7 @@
         <w:tc>
           <w:tcPr>
             <w:tcW w:type="dxa" w:w="2300"/>
-            <w:shd w:fill="1F3864" w:val="clear"/>
+            <w:shd w:fill="141414" w:val="clear"/>
             <w:tcMar>
               <w:top w:type="dxa" w:w="60"/>
               <w:left w:type="dxa" w:w="100"/>
@@ -5996,7 +6036,7 @@
         <w:tc>
           <w:tcPr>
             <w:tcW w:type="dxa" w:w="6726"/>
-            <w:shd w:fill="1F3864" w:val="clear"/>
+            <w:shd w:fill="141414" w:val="clear"/>
             <w:tcMar>
               <w:top w:type="dxa" w:w="60"/>
               <w:left w:type="dxa" w:w="100"/>
@@ -6253,7 +6293,7 @@
       <w:r>
         <w:drawing>
           <wp:inline distT="0" distB="0" distL="0" distR="0">
-            <wp:extent cx="5667375" cy="1685925"/>
+            <wp:extent cx="5667375" cy="3190875"/>
             <wp:effectExtent t="0" r="0" b="0" l="0"/>
             <wp:docPr id="13" name="" descr="" title=""/>
             <wp:cNvGraphicFramePr>
@@ -6278,7 +6318,7 @@
                   <pic:spPr bwMode="auto">
                     <a:xfrm>
                       <a:off x="0" y="0"/>
-                      <a:ext cx="5667375" cy="1685925"/>
+                      <a:ext cx="5667375" cy="3190875"/>
                     </a:xfrm>
                     <a:prstGeom prst="rect">
                       <a:avLst/>
@@ -6314,7 +6354,7 @@
         <w:tc>
           <w:tcPr>
             <w:tcW w:type="dxa" w:w="2300"/>
-            <w:shd w:fill="1F3864" w:val="clear"/>
+            <w:shd w:fill="141414" w:val="clear"/>
             <w:tcMar>
               <w:top w:type="dxa" w:w="60"/>
               <w:left w:type="dxa" w:w="100"/>
@@ -6339,7 +6379,7 @@
         <w:tc>
           <w:tcPr>
             <w:tcW w:type="dxa" w:w="6726"/>
-            <w:shd w:fill="1F3864" w:val="clear"/>
+            <w:shd w:fill="141414" w:val="clear"/>
             <w:tcMar>
               <w:top w:type="dxa" w:w="60"/>
               <w:left w:type="dxa" w:w="100"/>
@@ -6596,7 +6636,7 @@
       <w:r>
         <w:drawing>
           <wp:inline distT="0" distB="0" distL="0" distR="0">
-            <wp:extent cx="5667375" cy="1933575"/>
+            <wp:extent cx="5667375" cy="3190875"/>
             <wp:effectExtent t="0" r="0" b="0" l="0"/>
             <wp:docPr id="14" name="" descr="" title=""/>
             <wp:cNvGraphicFramePr>
@@ -6621,7 +6661,7 @@
                   <pic:spPr bwMode="auto">
                     <a:xfrm>
                       <a:off x="0" y="0"/>
-                      <a:ext cx="5667375" cy="1933575"/>
+                      <a:ext cx="5667375" cy="3190875"/>
                     </a:xfrm>
                     <a:prstGeom prst="rect">
                       <a:avLst/>
@@ -6657,7 +6697,7 @@
         <w:tc>
           <w:tcPr>
             <w:tcW w:type="dxa" w:w="2300"/>
-            <w:shd w:fill="1F3864" w:val="clear"/>
+            <w:shd w:fill="141414" w:val="clear"/>
             <w:tcMar>
               <w:top w:type="dxa" w:w="60"/>
               <w:left w:type="dxa" w:w="100"/>
@@ -6682,7 +6722,7 @@
         <w:tc>
           <w:tcPr>
             <w:tcW w:type="dxa" w:w="6726"/>
-            <w:shd w:fill="1F3864" w:val="clear"/>
+            <w:shd w:fill="141414" w:val="clear"/>
             <w:tcMar>
               <w:top w:type="dxa" w:w="60"/>
               <w:left w:type="dxa" w:w="100"/>
@@ -6948,7 +6988,7 @@
       <w:r>
         <w:drawing>
           <wp:inline distT="0" distB="0" distL="0" distR="0">
-            <wp:extent cx="5667375" cy="1933575"/>
+            <wp:extent cx="5667375" cy="3190875"/>
             <wp:effectExtent t="0" r="0" b="0" l="0"/>
             <wp:docPr id="15" name="" descr="" title=""/>
             <wp:cNvGraphicFramePr>
@@ -6973,7 +7013,7 @@
                   <pic:spPr bwMode="auto">
                     <a:xfrm>
                       <a:off x="0" y="0"/>
-                      <a:ext cx="5667375" cy="1933575"/>
+                      <a:ext cx="5667375" cy="3190875"/>
                     </a:xfrm>
                     <a:prstGeom prst="rect">
                       <a:avLst/>
@@ -7009,7 +7049,7 @@
         <w:tc>
           <w:tcPr>
             <w:tcW w:type="dxa" w:w="2300"/>
-            <w:shd w:fill="1F3864" w:val="clear"/>
+            <w:shd w:fill="141414" w:val="clear"/>
             <w:tcMar>
               <w:top w:type="dxa" w:w="60"/>
               <w:left w:type="dxa" w:w="100"/>
@@ -7034,7 +7074,7 @@
         <w:tc>
           <w:tcPr>
             <w:tcW w:type="dxa" w:w="6726"/>
-            <w:shd w:fill="1F3864" w:val="clear"/>
+            <w:shd w:fill="141414" w:val="clear"/>
             <w:tcMar>
               <w:top w:type="dxa" w:w="60"/>
               <w:left w:type="dxa" w:w="100"/>
@@ -7317,7 +7357,7 @@
       <w:r>
         <w:drawing>
           <wp:inline distT="0" distB="0" distL="0" distR="0">
-            <wp:extent cx="5667375" cy="1933575"/>
+            <wp:extent cx="5667375" cy="3190875"/>
             <wp:effectExtent t="0" r="0" b="0" l="0"/>
             <wp:docPr id="16" name="" descr="" title=""/>
             <wp:cNvGraphicFramePr>
@@ -7342,7 +7382,7 @@
                   <pic:spPr bwMode="auto">
                     <a:xfrm>
                       <a:off x="0" y="0"/>
-                      <a:ext cx="5667375" cy="1933575"/>
+                      <a:ext cx="5667375" cy="3190875"/>
                     </a:xfrm>
                     <a:prstGeom prst="rect">
                       <a:avLst/>
@@ -7378,7 +7418,7 @@
         <w:tc>
           <w:tcPr>
             <w:tcW w:type="dxa" w:w="2300"/>
-            <w:shd w:fill="1F3864" w:val="clear"/>
+            <w:shd w:fill="141414" w:val="clear"/>
             <w:tcMar>
               <w:top w:type="dxa" w:w="60"/>
               <w:left w:type="dxa" w:w="100"/>
@@ -7403,7 +7443,7 @@
         <w:tc>
           <w:tcPr>
             <w:tcW w:type="dxa" w:w="6726"/>
-            <w:shd w:fill="1F3864" w:val="clear"/>
+            <w:shd w:fill="141414" w:val="clear"/>
             <w:tcMar>
               <w:top w:type="dxa" w:w="60"/>
               <w:left w:type="dxa" w:w="100"/>
@@ -7712,7 +7752,7 @@
       <w:r>
         <w:drawing>
           <wp:inline distT="0" distB="0" distL="0" distR="0">
-            <wp:extent cx="5667375" cy="1933575"/>
+            <wp:extent cx="5667375" cy="3190875"/>
             <wp:effectExtent t="0" r="0" b="0" l="0"/>
             <wp:docPr id="17" name="" descr="" title=""/>
             <wp:cNvGraphicFramePr>
@@ -7737,7 +7777,7 @@
                   <pic:spPr bwMode="auto">
                     <a:xfrm>
                       <a:off x="0" y="0"/>
-                      <a:ext cx="5667375" cy="1933575"/>
+                      <a:ext cx="5667375" cy="3190875"/>
                     </a:xfrm>
                     <a:prstGeom prst="rect">
                       <a:avLst/>
@@ -7773,7 +7813,7 @@
         <w:tc>
           <w:tcPr>
             <w:tcW w:type="dxa" w:w="2300"/>
-            <w:shd w:fill="1F3864" w:val="clear"/>
+            <w:shd w:fill="141414" w:val="clear"/>
             <w:tcMar>
               <w:top w:type="dxa" w:w="60"/>
               <w:left w:type="dxa" w:w="100"/>
@@ -7798,7 +7838,7 @@
         <w:tc>
           <w:tcPr>
             <w:tcW w:type="dxa" w:w="6726"/>
-            <w:shd w:fill="1F3864" w:val="clear"/>
+            <w:shd w:fill="141414" w:val="clear"/>
             <w:tcMar>
               <w:top w:type="dxa" w:w="60"/>
               <w:left w:type="dxa" w:w="100"/>
@@ -8055,7 +8095,7 @@
       <w:r>
         <w:drawing>
           <wp:inline distT="0" distB="0" distL="0" distR="0">
-            <wp:extent cx="5667375" cy="1933575"/>
+            <wp:extent cx="5667375" cy="3190875"/>
             <wp:effectExtent t="0" r="0" b="0" l="0"/>
             <wp:docPr id="18" name="" descr="" title=""/>
             <wp:cNvGraphicFramePr>
@@ -8080,7 +8120,7 @@
                   <pic:spPr bwMode="auto">
                     <a:xfrm>
                       <a:off x="0" y="0"/>
-                      <a:ext cx="5667375" cy="1933575"/>
+                      <a:ext cx="5667375" cy="3190875"/>
                     </a:xfrm>
                     <a:prstGeom prst="rect">
                       <a:avLst/>
@@ -8116,7 +8156,7 @@
         <w:tc>
           <w:tcPr>
             <w:tcW w:type="dxa" w:w="2300"/>
-            <w:shd w:fill="1F3864" w:val="clear"/>
+            <w:shd w:fill="141414" w:val="clear"/>
             <w:tcMar>
               <w:top w:type="dxa" w:w="60"/>
               <w:left w:type="dxa" w:w="100"/>
@@ -8141,7 +8181,7 @@
         <w:tc>
           <w:tcPr>
             <w:tcW w:type="dxa" w:w="6726"/>
-            <w:shd w:fill="1F3864" w:val="clear"/>
+            <w:shd w:fill="141414" w:val="clear"/>
             <w:tcMar>
               <w:top w:type="dxa" w:w="60"/>
               <w:left w:type="dxa" w:w="100"/>
@@ -8407,7 +8447,7 @@
       <w:r>
         <w:drawing>
           <wp:inline distT="0" distB="0" distL="0" distR="0">
-            <wp:extent cx="5667375" cy="1685925"/>
+            <wp:extent cx="5667375" cy="3190875"/>
             <wp:effectExtent t="0" r="0" b="0" l="0"/>
             <wp:docPr id="19" name="" descr="" title=""/>
             <wp:cNvGraphicFramePr>
@@ -8432,7 +8472,7 @@
                   <pic:spPr bwMode="auto">
                     <a:xfrm>
                       <a:off x="0" y="0"/>
-                      <a:ext cx="5667375" cy="1685925"/>
+                      <a:ext cx="5667375" cy="3190875"/>
                     </a:xfrm>
                     <a:prstGeom prst="rect">
                       <a:avLst/>
@@ -8468,7 +8508,7 @@
         <w:tc>
           <w:tcPr>
             <w:tcW w:type="dxa" w:w="2300"/>
-            <w:shd w:fill="1F3864" w:val="clear"/>
+            <w:shd w:fill="141414" w:val="clear"/>
             <w:tcMar>
               <w:top w:type="dxa" w:w="60"/>
               <w:left w:type="dxa" w:w="100"/>
@@ -8493,7 +8533,7 @@
         <w:tc>
           <w:tcPr>
             <w:tcW w:type="dxa" w:w="6726"/>
-            <w:shd w:fill="1F3864" w:val="clear"/>
+            <w:shd w:fill="141414" w:val="clear"/>
             <w:tcMar>
               <w:top w:type="dxa" w:w="60"/>
               <w:left w:type="dxa" w:w="100"/>
@@ -8750,7 +8790,7 @@
       <w:r>
         <w:drawing>
           <wp:inline distT="0" distB="0" distL="0" distR="0">
-            <wp:extent cx="5667375" cy="1933575"/>
+            <wp:extent cx="5667375" cy="3190875"/>
             <wp:effectExtent t="0" r="0" b="0" l="0"/>
             <wp:docPr id="20" name="" descr="" title=""/>
             <wp:cNvGraphicFramePr>
@@ -8775,7 +8815,7 @@
                   <pic:spPr bwMode="auto">
                     <a:xfrm>
                       <a:off x="0" y="0"/>
-                      <a:ext cx="5667375" cy="1933575"/>
+                      <a:ext cx="5667375" cy="3190875"/>
                     </a:xfrm>
                     <a:prstGeom prst="rect">
                       <a:avLst/>
@@ -8811,7 +8851,7 @@
         <w:tc>
           <w:tcPr>
             <w:tcW w:type="dxa" w:w="2300"/>
-            <w:shd w:fill="1F3864" w:val="clear"/>
+            <w:shd w:fill="141414" w:val="clear"/>
             <w:tcMar>
               <w:top w:type="dxa" w:w="60"/>
               <w:left w:type="dxa" w:w="100"/>
@@ -8836,7 +8876,7 @@
         <w:tc>
           <w:tcPr>
             <w:tcW w:type="dxa" w:w="6726"/>
-            <w:shd w:fill="1F3864" w:val="clear"/>
+            <w:shd w:fill="141414" w:val="clear"/>
             <w:tcMar>
               <w:top w:type="dxa" w:w="60"/>
               <w:left w:type="dxa" w:w="100"/>
@@ -9093,7 +9133,7 @@
       <w:r>
         <w:drawing>
           <wp:inline distT="0" distB="0" distL="0" distR="0">
-            <wp:extent cx="5667375" cy="1933575"/>
+            <wp:extent cx="5667375" cy="3190875"/>
             <wp:effectExtent t="0" r="0" b="0" l="0"/>
             <wp:docPr id="21" name="" descr="" title=""/>
             <wp:cNvGraphicFramePr>
@@ -9118,7 +9158,7 @@
                   <pic:spPr bwMode="auto">
                     <a:xfrm>
                       <a:off x="0" y="0"/>
-                      <a:ext cx="5667375" cy="1933575"/>
+                      <a:ext cx="5667375" cy="3190875"/>
                     </a:xfrm>
                     <a:prstGeom prst="rect">
                       <a:avLst/>
@@ -9154,7 +9194,7 @@
         <w:tc>
           <w:tcPr>
             <w:tcW w:type="dxa" w:w="2300"/>
-            <w:shd w:fill="1F3864" w:val="clear"/>
+            <w:shd w:fill="141414" w:val="clear"/>
             <w:tcMar>
               <w:top w:type="dxa" w:w="60"/>
               <w:left w:type="dxa" w:w="100"/>
@@ -9179,7 +9219,7 @@
         <w:tc>
           <w:tcPr>
             <w:tcW w:type="dxa" w:w="6726"/>
-            <w:shd w:fill="1F3864" w:val="clear"/>
+            <w:shd w:fill="141414" w:val="clear"/>
             <w:tcMar>
               <w:top w:type="dxa" w:w="60"/>
               <w:left w:type="dxa" w:w="100"/>
@@ -9451,7 +9491,7 @@
         <w:tc>
           <w:tcPr>
             <w:tcW w:type="dxa" w:w="4513"/>
-            <w:shd w:fill="1F3864" w:val="clear"/>
+            <w:shd w:fill="141414" w:val="clear"/>
             <w:tcMar>
               <w:top w:type="dxa" w:w="60"/>
               <w:left w:type="dxa" w:w="100"/>
@@ -9476,7 +9516,7 @@
         <w:tc>
           <w:tcPr>
             <w:tcW w:type="dxa" w:w="4513"/>
-            <w:shd w:fill="1F3864" w:val="clear"/>
+            <w:shd w:fill="141414" w:val="clear"/>
             <w:tcMar>
               <w:top w:type="dxa" w:w="60"/>
               <w:left w:type="dxa" w:w="100"/>
@@ -9871,7 +9911,7 @@
         <w:sz w:val="16"/>
         <w:szCs w:val="16"/>
       </w:rPr>
-      <w:t xml:space="preserve">RentaMovil — Análisis del Software</w:t>
+      <w:t xml:space="preserve">RentaMovil</w:t>
     </w:r>
   </w:p>
 </w:hdr>
@@ -10178,7 +10218,7 @@
       <w:rFonts w:ascii="Calibri" w:cs="Calibri" w:eastAsia="Calibri" w:hAnsi="Calibri"/>
       <w:b/>
       <w:bCs/>
-      <w:color w:val="1F3864"/>
+      <w:color w:val="141414"/>
       <w:sz w:val="30"/>
       <w:szCs w:val="30"/>
     </w:rPr>
@@ -10196,7 +10236,7 @@
       <w:rFonts w:ascii="Calibri" w:cs="Calibri" w:eastAsia="Calibri" w:hAnsi="Calibri"/>
       <w:b/>
       <w:bCs/>
-      <w:color w:val="2E4F87"/>
+      <w:color w:val="404040"/>
       <w:sz w:val="25"/>
       <w:szCs w:val="25"/>
     </w:rPr>
@@ -10214,7 +10254,7 @@
       <w:rFonts w:ascii="Calibri" w:cs="Calibri" w:eastAsia="Calibri" w:hAnsi="Calibri"/>
       <w:b/>
       <w:bCs/>
-      <w:color w:val="3B5EA6"/>
+      <w:color w:val="606060"/>
       <w:sz w:val="22"/>
       <w:szCs w:val="22"/>
     </w:rPr>

</xml_diff>

<commit_message>
docs: revert cover pages to plain white/black style
The dark full-page cover table was wrong — only the accent colors
(table headers, headings) were meant to move away from navy blue, not
the cover page itself. Covers are now plain white background with
centered black text, matching the reference layout.

Co-Authored-By: Claude Sonnet 5 <noreply@anthropic.com>
</commit_message>
<xml_diff>
--- a/02-documentacion-analisis-software/01-Casos-de-Uso.docx
+++ b/02-documentacion-analisis-software/01-Casos-de-Uso.docx
@@ -2,134 +2,94 @@
 <file path=word/document.xml><?xml version="1.0" encoding="utf-8"?>
 <w:document xmlns:wpc="http://schemas.microsoft.com/office/word/2010/wordprocessingCanvas" xmlns:mc="http://schemas.openxmlformats.org/markup-compatibility/2006" xmlns:o="urn:schemas-microsoft-com:office:office" xmlns:r="http://schemas.openxmlformats.org/officeDocument/2006/relationships" xmlns:m="http://schemas.openxmlformats.org/officeDocument/2006/math" xmlns:v="urn:schemas-microsoft-com:vml" xmlns:wp14="http://schemas.microsoft.com/office/word/2010/wordprocessingDrawing" xmlns:wp="http://schemas.openxmlformats.org/drawingml/2006/wordprocessingDrawing" xmlns:w10="urn:schemas-microsoft-com:office:word" xmlns:w="http://schemas.openxmlformats.org/wordprocessingml/2006/main" xmlns:w14="http://schemas.microsoft.com/office/word/2010/wordml" xmlns:w15="http://schemas.microsoft.com/office/word/2012/wordml" xmlns:wpg="http://schemas.microsoft.com/office/word/2010/wordprocessingGroup" xmlns:wpi="http://schemas.microsoft.com/office/word/2010/wordprocessingInk" xmlns:wne="http://schemas.microsoft.com/office/word/2006/wordml" xmlns:wps="http://schemas.microsoft.com/office/word/2010/wordprocessingShape" xmlns:cx="http://schemas.microsoft.com/office/drawing/2014/chartex" xmlns:cx1="http://schemas.microsoft.com/office/drawing/2015/9/8/chartex" xmlns:cx2="http://schemas.microsoft.com/office/drawing/2015/10/21/chartex" xmlns:cx3="http://schemas.microsoft.com/office/drawing/2016/5/9/chartex" xmlns:cx4="http://schemas.microsoft.com/office/drawing/2016/5/10/chartex" xmlns:cx5="http://schemas.microsoft.com/office/drawing/2016/5/11/chartex" xmlns:cx6="http://schemas.microsoft.com/office/drawing/2016/5/12/chartex" xmlns:cx7="http://schemas.microsoft.com/office/drawing/2016/5/13/chartex" xmlns:cx8="http://schemas.microsoft.com/office/drawing/2016/5/14/chartex" xmlns:aink="http://schemas.microsoft.com/office/drawing/2016/ink" xmlns:am3d="http://schemas.microsoft.com/office/drawing/2017/model3d" xmlns:w16cex="http://schemas.microsoft.com/office/word/2018/wordml/cex" xmlns:w16cid="http://schemas.microsoft.com/office/word/2016/wordml/cid" xmlns:w16="http://schemas.microsoft.com/office/word/2018/wordml" xmlns:w16sdtdh="http://schemas.microsoft.com/office/word/2020/wordml/sdtdatahash" xmlns:w16se="http://schemas.microsoft.com/office/word/2015/wordml/symex" mc:Ignorable="w14 w15 wp14">
   <w:body>
-    <w:tbl>
-      <w:tblPr>
-        <w:tblW w:type="dxa" w:w="9026"/>
-        <w:tblBorders>
-          <w:top w:val="none" w:color="FFFFFF" w:sz="0"/>
-          <w:left w:val="none" w:color="FFFFFF" w:sz="0"/>
-          <w:bottom w:val="none" w:color="FFFFFF" w:sz="0"/>
-          <w:right w:val="none" w:color="FFFFFF" w:sz="0"/>
-          <w:insideH w:val="none" w:color="FFFFFF" w:sz="0"/>
-          <w:insideV w:val="none" w:color="FFFFFF" w:sz="0"/>
-        </w:tblBorders>
-      </w:tblPr>
-      <w:tblGrid>
-        <w:gridCol w:w="9026"/>
-      </w:tblGrid>
-      <w:tr>
-        <w:trPr>
-          <w:trHeight w:val="13600" w:hRule="exact"/>
-        </w:trPr>
-        <w:tc>
-          <w:tcPr>
-            <w:tcW w:type="dxa" w:w="9026"/>
-            <w:shd w:fill="0B0B0B" w:val="clear"/>
-            <w:tcMar>
-              <w:top w:type="dxa" w:w="200"/>
-              <w:left w:type="dxa" w:w="400"/>
-              <w:bottom w:type="dxa" w:w="200"/>
-              <w:right w:type="dxa" w:w="400"/>
-            </w:tcMar>
-            <w:vAlign w:val="center"/>
-          </w:tcPr>
-          <w:p>
-            <w:pPr>
-              <w:spacing w:after="200" w:before="200"/>
-              <w:jc w:val="center"/>
-            </w:pPr>
-            <w:r>
-              <w:rPr>
-                <w:rFonts w:ascii="Calibri" w:cs="Calibri" w:eastAsia="Calibri" w:hAnsi="Calibri"/>
-                <w:b/>
-                <w:bCs/>
-                <w:color w:val="FFFFFF"/>
-                <w:sz w:val="40"/>
-                <w:szCs w:val="40"/>
-              </w:rPr>
-              <w:t xml:space="preserve">DOCUMENTACIÓN DE ANÁLISIS DEL SOFTWARE — CASOS DE USO</w:t>
-            </w:r>
-          </w:p>
-          <w:p>
-            <w:pPr>
-              <w:spacing w:after="300" w:before="100"/>
-              <w:jc w:val="center"/>
-            </w:pPr>
-            <w:r>
-              <w:rPr>
-                <w:rFonts w:ascii="Calibri" w:cs="Calibri" w:eastAsia="Calibri" w:hAnsi="Calibri"/>
-                <w:b/>
-                <w:bCs/>
-                <w:color w:val="FFFFFF"/>
-                <w:sz w:val="30"/>
-                <w:szCs w:val="30"/>
-              </w:rPr>
-              <w:t xml:space="preserve">PROYECTO: RENTAMOVIL — PLATAFORMA PARA EMPRESA DE ALQUILER DE VEHÍCULOS</w:t>
-            </w:r>
-          </w:p>
-          <w:p>
-            <w:pPr>
-              <w:spacing w:after="160" w:line="276"/>
-              <w:jc w:val="center"/>
-            </w:pPr>
-            <w:r>
-              <w:rPr>
-                <w:rFonts w:ascii="Calibri" w:cs="Calibri" w:eastAsia="Calibri" w:hAnsi="Calibri"/>
-                <w:b/>
-                <w:bCs/>
-                <w:color w:val="FFFFFF"/>
-                <w:sz w:val="21"/>
-                <w:szCs w:val="21"/>
-              </w:rPr>
-              <w:t xml:space="preserve">INTEGRANTES:</w:t>
-            </w:r>
-            <w:r>
-              <w:rPr>
-                <w:rFonts w:ascii="Calibri" w:cs="Calibri" w:eastAsia="Calibri" w:hAnsi="Calibri"/>
-                <w:color w:val="FFFFFF"/>
-                <w:sz w:val="21"/>
-                <w:szCs w:val="21"/>
-              </w:rPr>
-              <w:t xml:space="preserve"> Thiago Fabian Rojas Guevara — David Santiago Erez Rodríguez — Nicole Dayana Ramírez Vargas</w:t>
-            </w:r>
-          </w:p>
-          <w:p>
-            <w:pPr>
-              <w:spacing w:after="160" w:line="276"/>
-              <w:jc w:val="center"/>
-            </w:pPr>
-            <w:r>
-              <w:rPr>
-                <w:rFonts w:ascii="Calibri" w:cs="Calibri" w:eastAsia="Calibri" w:hAnsi="Calibri"/>
-                <w:b/>
-                <w:bCs/>
-                <w:color w:val="FFFFFF"/>
-                <w:sz w:val="21"/>
-                <w:szCs w:val="21"/>
-              </w:rPr>
-              <w:t xml:space="preserve">SERVICIO NACIONAL DE APRENDIZAJE — SENA — ANÁLISIS Y DESARROLLO DE SOFTWARE 3145556</w:t>
-            </w:r>
-          </w:p>
-          <w:p>
-            <w:pPr>
-              <w:spacing w:after="160" w:line="276"/>
-              <w:jc w:val="center"/>
-            </w:pPr>
-            <w:r>
-              <w:rPr>
-                <w:rFonts w:ascii="Calibri" w:cs="Calibri" w:eastAsia="Calibri" w:hAnsi="Calibri"/>
-                <w:b/>
-                <w:bCs/>
-                <w:color w:val="FFFFFF"/>
-                <w:sz w:val="21"/>
-                <w:szCs w:val="21"/>
-              </w:rPr>
-              <w:t xml:space="preserve">2026</w:t>
-            </w:r>
-          </w:p>
-        </w:tc>
-      </w:tr>
-    </w:tbl>
+    <w:p>
+      <w:pPr>
+        <w:spacing w:after="200" w:before="200"/>
+        <w:jc w:val="center"/>
+      </w:pPr>
+      <w:r>
+        <w:rPr>
+          <w:rFonts w:ascii="Calibri" w:cs="Calibri" w:eastAsia="Calibri" w:hAnsi="Calibri"/>
+          <w:b/>
+          <w:bCs/>
+          <w:sz w:val="32"/>
+          <w:szCs w:val="32"/>
+        </w:rPr>
+        <w:t xml:space="preserve">DOCUMENTACIÓN DE ANÁLISIS DEL SOFTWARE — CASOS DE USO</w:t>
+      </w:r>
+    </w:p>
+    <w:p>
+      <w:pPr>
+        <w:spacing w:after="400" w:before="400"/>
+        <w:jc w:val="center"/>
+      </w:pPr>
+      <w:r>
+        <w:rPr>
+          <w:rFonts w:ascii="Calibri" w:cs="Calibri" w:eastAsia="Calibri" w:hAnsi="Calibri"/>
+          <w:b w:val="false"/>
+          <w:bCs w:val="false"/>
+          <w:sz w:val="24"/>
+          <w:szCs w:val="24"/>
+        </w:rPr>
+        <w:t xml:space="preserve">PROYECTO: RENTAMOVIL — PLATAFORMA PARA EMPRESA DE ALQUILER DE VEHÍCULOS</w:t>
+      </w:r>
+    </w:p>
+    <w:p>
+      <w:pPr>
+        <w:spacing w:after="300" w:before="300" w:line="276"/>
+        <w:jc w:val="center"/>
+      </w:pPr>
+      <w:r>
+        <w:rPr>
+          <w:rFonts w:ascii="Calibri" w:cs="Calibri" w:eastAsia="Calibri" w:hAnsi="Calibri"/>
+          <w:b/>
+          <w:bCs/>
+          <w:sz w:val="21"/>
+          <w:szCs w:val="21"/>
+        </w:rPr>
+        <w:t xml:space="preserve">INTEGRANTES:</w:t>
+      </w:r>
+      <w:r>
+        <w:rPr>
+          <w:rFonts w:ascii="Calibri" w:cs="Calibri" w:eastAsia="Calibri" w:hAnsi="Calibri"/>
+          <w:sz w:val="21"/>
+          <w:szCs w:val="21"/>
+        </w:rPr>
+        <w:t xml:space="preserve"> Thiago Fabian Rojas Guevara — David Santiago Erez Rodríguez — Nicole Dayana Ramírez Vargas</w:t>
+      </w:r>
+    </w:p>
+    <w:p>
+      <w:pPr>
+        <w:spacing w:after="300" w:before="300" w:line="276"/>
+        <w:jc w:val="center"/>
+      </w:pPr>
+      <w:r>
+        <w:rPr>
+          <w:rFonts w:ascii="Calibri" w:cs="Calibri" w:eastAsia="Calibri" w:hAnsi="Calibri"/>
+          <w:b/>
+          <w:bCs/>
+          <w:sz w:val="21"/>
+          <w:szCs w:val="21"/>
+        </w:rPr>
+        <w:t xml:space="preserve">SERVICIO NACIONAL DE APRENDIZAJE — SENA — ANÁLISIS Y DESARROLLO DE SOFTWARE 3145556</w:t>
+      </w:r>
+    </w:p>
+    <w:p>
+      <w:pPr>
+        <w:spacing w:after="300" w:before="300" w:line="276"/>
+        <w:jc w:val="center"/>
+      </w:pPr>
+      <w:r>
+        <w:rPr>
+          <w:rFonts w:ascii="Calibri" w:cs="Calibri" w:eastAsia="Calibri" w:hAnsi="Calibri"/>
+          <w:b/>
+          <w:bCs/>
+          <w:sz w:val="21"/>
+          <w:szCs w:val="21"/>
+        </w:rPr>
+        <w:t xml:space="preserve">2026</w:t>
+      </w:r>
+    </w:p>
     <w:p>
       <w:r>
         <w:br w:type="page"/>

</xml_diff>

<commit_message>
docs: make use-case diagrams more detailed
Each use case now shows its actual sub-steps instead of a single
generic oval — either a sequential chain (e.g. Sign up: fill form ->
validate -> create account) or a fan-out from an entry point (e.g.
Manage vehicles: enter system -> register / edit / retire), matching
the reference UML style more closely.

Co-Authored-By: Claude Sonnet 5 <noreply@anthropic.com>
</commit_message>
<xml_diff>
--- a/02-documentacion-analisis-software/01-Casos-de-Uso.docx
+++ b/02-documentacion-analisis-software/01-Casos-de-Uso.docx
@@ -2022,7 +2022,7 @@
       <w:r>
         <w:drawing>
           <wp:inline distT="0" distB="0" distL="0" distR="0">
-            <wp:extent cx="5667375" cy="3190875"/>
+            <wp:extent cx="5667375" cy="3771900"/>
             <wp:effectExtent t="0" r="0" b="0" l="0"/>
             <wp:docPr id="1" name="" descr="" title=""/>
             <wp:cNvGraphicFramePr>
@@ -2047,7 +2047,7 @@
                   <pic:spPr bwMode="auto">
                     <a:xfrm>
                       <a:off x="0" y="0"/>
-                      <a:ext cx="5667375" cy="3190875"/>
+                      <a:ext cx="5667375" cy="3771900"/>
                     </a:xfrm>
                     <a:prstGeom prst="rect">
                       <a:avLst/>
@@ -2382,7 +2382,7 @@
       <w:r>
         <w:drawing>
           <wp:inline distT="0" distB="0" distL="0" distR="0">
-            <wp:extent cx="5667375" cy="3190875"/>
+            <wp:extent cx="5667375" cy="3771900"/>
             <wp:effectExtent t="0" r="0" b="0" l="0"/>
             <wp:docPr id="2" name="" descr="" title=""/>
             <wp:cNvGraphicFramePr>
@@ -2407,7 +2407,7 @@
                   <pic:spPr bwMode="auto">
                     <a:xfrm>
                       <a:off x="0" y="0"/>
-                      <a:ext cx="5667375" cy="3190875"/>
+                      <a:ext cx="5667375" cy="3771900"/>
                     </a:xfrm>
                     <a:prstGeom prst="rect">
                       <a:avLst/>
@@ -2734,7 +2734,7 @@
       <w:r>
         <w:drawing>
           <wp:inline distT="0" distB="0" distL="0" distR="0">
-            <wp:extent cx="5667375" cy="3190875"/>
+            <wp:extent cx="5667375" cy="3771900"/>
             <wp:effectExtent t="0" r="0" b="0" l="0"/>
             <wp:docPr id="3" name="" descr="" title=""/>
             <wp:cNvGraphicFramePr>
@@ -2759,7 +2759,7 @@
                   <pic:spPr bwMode="auto">
                     <a:xfrm>
                       <a:off x="0" y="0"/>
-                      <a:ext cx="5667375" cy="3190875"/>
+                      <a:ext cx="5667375" cy="3771900"/>
                     </a:xfrm>
                     <a:prstGeom prst="rect">
                       <a:avLst/>
@@ -3086,7 +3086,7 @@
       <w:r>
         <w:drawing>
           <wp:inline distT="0" distB="0" distL="0" distR="0">
-            <wp:extent cx="5667375" cy="3190875"/>
+            <wp:extent cx="5667375" cy="3771900"/>
             <wp:effectExtent t="0" r="0" b="0" l="0"/>
             <wp:docPr id="4" name="" descr="" title=""/>
             <wp:cNvGraphicFramePr>
@@ -3111,7 +3111,7 @@
                   <pic:spPr bwMode="auto">
                     <a:xfrm>
                       <a:off x="0" y="0"/>
-                      <a:ext cx="5667375" cy="3190875"/>
+                      <a:ext cx="5667375" cy="3771900"/>
                     </a:xfrm>
                     <a:prstGeom prst="rect">
                       <a:avLst/>
@@ -3429,7 +3429,7 @@
       <w:r>
         <w:drawing>
           <wp:inline distT="0" distB="0" distL="0" distR="0">
-            <wp:extent cx="5667375" cy="3190875"/>
+            <wp:extent cx="5667375" cy="3590925"/>
             <wp:effectExtent t="0" r="0" b="0" l="0"/>
             <wp:docPr id="5" name="" descr="" title=""/>
             <wp:cNvGraphicFramePr>
@@ -3454,7 +3454,7 @@
                   <pic:spPr bwMode="auto">
                     <a:xfrm>
                       <a:off x="0" y="0"/>
-                      <a:ext cx="5667375" cy="3190875"/>
+                      <a:ext cx="5667375" cy="3590925"/>
                     </a:xfrm>
                     <a:prstGeom prst="rect">
                       <a:avLst/>
@@ -3772,7 +3772,7 @@
       <w:r>
         <w:drawing>
           <wp:inline distT="0" distB="0" distL="0" distR="0">
-            <wp:extent cx="5667375" cy="3190875"/>
+            <wp:extent cx="5667375" cy="3771900"/>
             <wp:effectExtent t="0" r="0" b="0" l="0"/>
             <wp:docPr id="6" name="" descr="" title=""/>
             <wp:cNvGraphicFramePr>
@@ -3797,7 +3797,7 @@
                   <pic:spPr bwMode="auto">
                     <a:xfrm>
                       <a:off x="0" y="0"/>
-                      <a:ext cx="5667375" cy="3190875"/>
+                      <a:ext cx="5667375" cy="3771900"/>
                     </a:xfrm>
                     <a:prstGeom prst="rect">
                       <a:avLst/>
@@ -4133,7 +4133,7 @@
       <w:r>
         <w:drawing>
           <wp:inline distT="0" distB="0" distL="0" distR="0">
-            <wp:extent cx="5667375" cy="3190875"/>
+            <wp:extent cx="5667375" cy="2781300"/>
             <wp:effectExtent t="0" r="0" b="0" l="0"/>
             <wp:docPr id="7" name="" descr="" title=""/>
             <wp:cNvGraphicFramePr>
@@ -4158,7 +4158,7 @@
                   <pic:spPr bwMode="auto">
                     <a:xfrm>
                       <a:off x="0" y="0"/>
-                      <a:ext cx="5667375" cy="3190875"/>
+                      <a:ext cx="5667375" cy="2781300"/>
                     </a:xfrm>
                     <a:prstGeom prst="rect">
                       <a:avLst/>
@@ -4476,7 +4476,7 @@
       <w:r>
         <w:drawing>
           <wp:inline distT="0" distB="0" distL="0" distR="0">
-            <wp:extent cx="5667375" cy="3190875"/>
+            <wp:extent cx="5667375" cy="2819400"/>
             <wp:effectExtent t="0" r="0" b="0" l="0"/>
             <wp:docPr id="8" name="" descr="" title=""/>
             <wp:cNvGraphicFramePr>
@@ -4501,7 +4501,7 @@
                   <pic:spPr bwMode="auto">
                     <a:xfrm>
                       <a:off x="0" y="0"/>
-                      <a:ext cx="5667375" cy="3190875"/>
+                      <a:ext cx="5667375" cy="2819400"/>
                     </a:xfrm>
                     <a:prstGeom prst="rect">
                       <a:avLst/>
@@ -4837,7 +4837,7 @@
       <w:r>
         <w:drawing>
           <wp:inline distT="0" distB="0" distL="0" distR="0">
-            <wp:extent cx="5667375" cy="3190875"/>
+            <wp:extent cx="5667375" cy="3771900"/>
             <wp:effectExtent t="0" r="0" b="0" l="0"/>
             <wp:docPr id="9" name="" descr="" title=""/>
             <wp:cNvGraphicFramePr>
@@ -4862,7 +4862,7 @@
                   <pic:spPr bwMode="auto">
                     <a:xfrm>
                       <a:off x="0" y="0"/>
-                      <a:ext cx="5667375" cy="3190875"/>
+                      <a:ext cx="5667375" cy="3771900"/>
                     </a:xfrm>
                     <a:prstGeom prst="rect">
                       <a:avLst/>
@@ -5224,7 +5224,7 @@
       <w:r>
         <w:drawing>
           <wp:inline distT="0" distB="0" distL="0" distR="0">
-            <wp:extent cx="5667375" cy="3190875"/>
+            <wp:extent cx="5667375" cy="2819400"/>
             <wp:effectExtent t="0" r="0" b="0" l="0"/>
             <wp:docPr id="10" name="" descr="" title=""/>
             <wp:cNvGraphicFramePr>
@@ -5249,7 +5249,7 @@
                   <pic:spPr bwMode="auto">
                     <a:xfrm>
                       <a:off x="0" y="0"/>
-                      <a:ext cx="5667375" cy="3190875"/>
+                      <a:ext cx="5667375" cy="2819400"/>
                     </a:xfrm>
                     <a:prstGeom prst="rect">
                       <a:avLst/>
@@ -5567,7 +5567,7 @@
       <w:r>
         <w:drawing>
           <wp:inline distT="0" distB="0" distL="0" distR="0">
-            <wp:extent cx="5667375" cy="3190875"/>
+            <wp:extent cx="5667375" cy="2819400"/>
             <wp:effectExtent t="0" r="0" b="0" l="0"/>
             <wp:docPr id="11" name="" descr="" title=""/>
             <wp:cNvGraphicFramePr>
@@ -5592,7 +5592,7 @@
                   <pic:spPr bwMode="auto">
                     <a:xfrm>
                       <a:off x="0" y="0"/>
-                      <a:ext cx="5667375" cy="3190875"/>
+                      <a:ext cx="5667375" cy="2819400"/>
                     </a:xfrm>
                     <a:prstGeom prst="rect">
                       <a:avLst/>
@@ -5910,7 +5910,7 @@
       <w:r>
         <w:drawing>
           <wp:inline distT="0" distB="0" distL="0" distR="0">
-            <wp:extent cx="5667375" cy="3190875"/>
+            <wp:extent cx="5667375" cy="3590925"/>
             <wp:effectExtent t="0" r="0" b="0" l="0"/>
             <wp:docPr id="12" name="" descr="" title=""/>
             <wp:cNvGraphicFramePr>
@@ -5935,7 +5935,7 @@
                   <pic:spPr bwMode="auto">
                     <a:xfrm>
                       <a:off x="0" y="0"/>
-                      <a:ext cx="5667375" cy="3190875"/>
+                      <a:ext cx="5667375" cy="3590925"/>
                     </a:xfrm>
                     <a:prstGeom prst="rect">
                       <a:avLst/>
@@ -6253,7 +6253,7 @@
       <w:r>
         <w:drawing>
           <wp:inline distT="0" distB="0" distL="0" distR="0">
-            <wp:extent cx="5667375" cy="3190875"/>
+            <wp:extent cx="5667375" cy="3590925"/>
             <wp:effectExtent t="0" r="0" b="0" l="0"/>
             <wp:docPr id="13" name="" descr="" title=""/>
             <wp:cNvGraphicFramePr>
@@ -6278,7 +6278,7 @@
                   <pic:spPr bwMode="auto">
                     <a:xfrm>
                       <a:off x="0" y="0"/>
-                      <a:ext cx="5667375" cy="3190875"/>
+                      <a:ext cx="5667375" cy="3590925"/>
                     </a:xfrm>
                     <a:prstGeom prst="rect">
                       <a:avLst/>
@@ -6596,7 +6596,7 @@
       <w:r>
         <w:drawing>
           <wp:inline distT="0" distB="0" distL="0" distR="0">
-            <wp:extent cx="5667375" cy="3190875"/>
+            <wp:extent cx="5667375" cy="3771900"/>
             <wp:effectExtent t="0" r="0" b="0" l="0"/>
             <wp:docPr id="14" name="" descr="" title=""/>
             <wp:cNvGraphicFramePr>
@@ -6621,7 +6621,7 @@
                   <pic:spPr bwMode="auto">
                     <a:xfrm>
                       <a:off x="0" y="0"/>
-                      <a:ext cx="5667375" cy="3190875"/>
+                      <a:ext cx="5667375" cy="3771900"/>
                     </a:xfrm>
                     <a:prstGeom prst="rect">
                       <a:avLst/>
@@ -6948,7 +6948,7 @@
       <w:r>
         <w:drawing>
           <wp:inline distT="0" distB="0" distL="0" distR="0">
-            <wp:extent cx="5667375" cy="3190875"/>
+            <wp:extent cx="5667375" cy="2781300"/>
             <wp:effectExtent t="0" r="0" b="0" l="0"/>
             <wp:docPr id="15" name="" descr="" title=""/>
             <wp:cNvGraphicFramePr>
@@ -6973,7 +6973,7 @@
                   <pic:spPr bwMode="auto">
                     <a:xfrm>
                       <a:off x="0" y="0"/>
-                      <a:ext cx="5667375" cy="3190875"/>
+                      <a:ext cx="5667375" cy="2781300"/>
                     </a:xfrm>
                     <a:prstGeom prst="rect">
                       <a:avLst/>
@@ -7317,7 +7317,7 @@
       <w:r>
         <w:drawing>
           <wp:inline distT="0" distB="0" distL="0" distR="0">
-            <wp:extent cx="5667375" cy="3190875"/>
+            <wp:extent cx="5667375" cy="2781300"/>
             <wp:effectExtent t="0" r="0" b="0" l="0"/>
             <wp:docPr id="16" name="" descr="" title=""/>
             <wp:cNvGraphicFramePr>
@@ -7342,7 +7342,7 @@
                   <pic:spPr bwMode="auto">
                     <a:xfrm>
                       <a:off x="0" y="0"/>
-                      <a:ext cx="5667375" cy="3190875"/>
+                      <a:ext cx="5667375" cy="2781300"/>
                     </a:xfrm>
                     <a:prstGeom prst="rect">
                       <a:avLst/>
@@ -7712,7 +7712,7 @@
       <w:r>
         <w:drawing>
           <wp:inline distT="0" distB="0" distL="0" distR="0">
-            <wp:extent cx="5667375" cy="3190875"/>
+            <wp:extent cx="5667375" cy="2781300"/>
             <wp:effectExtent t="0" r="0" b="0" l="0"/>
             <wp:docPr id="17" name="" descr="" title=""/>
             <wp:cNvGraphicFramePr>
@@ -7737,7 +7737,7 @@
                   <pic:spPr bwMode="auto">
                     <a:xfrm>
                       <a:off x="0" y="0"/>
-                      <a:ext cx="5667375" cy="3190875"/>
+                      <a:ext cx="5667375" cy="2781300"/>
                     </a:xfrm>
                     <a:prstGeom prst="rect">
                       <a:avLst/>
@@ -8055,7 +8055,7 @@
       <w:r>
         <w:drawing>
           <wp:inline distT="0" distB="0" distL="0" distR="0">
-            <wp:extent cx="5667375" cy="3190875"/>
+            <wp:extent cx="5667375" cy="2781300"/>
             <wp:effectExtent t="0" r="0" b="0" l="0"/>
             <wp:docPr id="18" name="" descr="" title=""/>
             <wp:cNvGraphicFramePr>
@@ -8080,7 +8080,7 @@
                   <pic:spPr bwMode="auto">
                     <a:xfrm>
                       <a:off x="0" y="0"/>
-                      <a:ext cx="5667375" cy="3190875"/>
+                      <a:ext cx="5667375" cy="2781300"/>
                     </a:xfrm>
                     <a:prstGeom prst="rect">
                       <a:avLst/>
@@ -8407,7 +8407,7 @@
       <w:r>
         <w:drawing>
           <wp:inline distT="0" distB="0" distL="0" distR="0">
-            <wp:extent cx="5667375" cy="3190875"/>
+            <wp:extent cx="5667375" cy="2781300"/>
             <wp:effectExtent t="0" r="0" b="0" l="0"/>
             <wp:docPr id="19" name="" descr="" title=""/>
             <wp:cNvGraphicFramePr>
@@ -8432,7 +8432,7 @@
                   <pic:spPr bwMode="auto">
                     <a:xfrm>
                       <a:off x="0" y="0"/>
-                      <a:ext cx="5667375" cy="3190875"/>
+                      <a:ext cx="5667375" cy="2781300"/>
                     </a:xfrm>
                     <a:prstGeom prst="rect">
                       <a:avLst/>
@@ -8750,7 +8750,7 @@
       <w:r>
         <w:drawing>
           <wp:inline distT="0" distB="0" distL="0" distR="0">
-            <wp:extent cx="5667375" cy="3190875"/>
+            <wp:extent cx="5667375" cy="2781300"/>
             <wp:effectExtent t="0" r="0" b="0" l="0"/>
             <wp:docPr id="20" name="" descr="" title=""/>
             <wp:cNvGraphicFramePr>
@@ -8775,7 +8775,7 @@
                   <pic:spPr bwMode="auto">
                     <a:xfrm>
                       <a:off x="0" y="0"/>
-                      <a:ext cx="5667375" cy="3190875"/>
+                      <a:ext cx="5667375" cy="2781300"/>
                     </a:xfrm>
                     <a:prstGeom prst="rect">
                       <a:avLst/>
@@ -9093,7 +9093,7 @@
       <w:r>
         <w:drawing>
           <wp:inline distT="0" distB="0" distL="0" distR="0">
-            <wp:extent cx="5667375" cy="3190875"/>
+            <wp:extent cx="5667375" cy="2781300"/>
             <wp:effectExtent t="0" r="0" b="0" l="0"/>
             <wp:docPr id="21" name="" descr="" title=""/>
             <wp:cNvGraphicFramePr>
@@ -9118,7 +9118,7 @@
                   <pic:spPr bwMode="auto">
                     <a:xfrm>
                       <a:off x="0" y="0"/>
-                      <a:ext cx="5667375" cy="3190875"/>
+                      <a:ext cx="5667375" cy="2781300"/>
                     </a:xfrm>
                     <a:prstGeom prst="rect">
                       <a:avLst/>

</xml_diff>